<commit_message>
Paper: add fine-tuning setup, scaling results (Table 6, Figure 2), updated limitations
Co-Authored-By: Claude Opus 5.5 <noreply@anthropic.com>
</commit_message>
<xml_diff>
--- a/paper/khmer_asr_paper_draft.docx
+++ b/paper/khmer_asr_paper_draft.docx
@@ -11,7 +11,7 @@
           <w:color w:val="B03A2E"/>
           <w:sz w:val="16"/>
         </w:rPr>
-        <w:t>DRAFT FOR ADVISOR REVIEW — 23 Oct 2026 — fine-tuning results (M1–M3) pending</w:t>
+        <w:t>DRAFT FOR ADVISOR REVIEW — 30 Oct 2026 — Khmer-specific strategy (M2) pending</w:t>
       </w:r>
     </w:p>
     <w:p>
@@ -23,7 +23,7 @@
           <w:b/>
           <w:sz w:val="30"/>
         </w:rPr>
-        <w:t>Fine-Tuning Pretrained Models for Khmer Speech Recognition: A Leakage-Free Evaluation Protocol and Zero-Shot Baselines</w:t>
+        <w:t>Fine-Tuning Pretrained Models for Khmer Speech Recognition: Leakage-Free Evaluation, Zero-Shot Baselines and Data Scaling</w:t>
       </w:r>
     </w:p>
     <w:p>
@@ -61,7 +61,7 @@
         <w:jc w:val="both"/>
       </w:pPr>
       <w:r>
-        <w:t>Khmer remains under-resourced for automatic speech recognition (ASR), and published Khmer results are hard to compare because they use different test sets, text normalization and training data. We audit the full Digital Divide Data Khmer corpus (450,396 utterances, 1,073.9 h, 20 speakers) and find that every sentence is read by four different speakers, so a random split leaks test sentences into training. We define a split that holds out both speakers and every sentence they read, a documented Khmer text normalization protocol, and a space-insensitive character error rate (CER). Zero-shot, all three Whisper models fail on Khmer (CER ≥ 133%), looping on a repeated character or misidentifying the language, whereas the MMS-1B CTC model with its Khmer adapter reaches 9.7% CER on the held-out test set. These results set the baselines for controlled fine-tuning experiments on data quantity and Khmer-specific strategies.</w:t>
+        <w:t>Khmer remains under-resourced for automatic speech recognition (ASR), and published Khmer results are hard to compare because they use different test sets, text normalization and training data. We audit the full Digital Divide Data Khmer corpus (450,396 utterances, 1,073.9 h, 20 speakers) and find that every sentence is read by four different speakers, so a random split leaks test sentences into training. We define a split that holds out both speakers and every sentence they read, a documented Khmer text normalization protocol, and a space-insensitive character error rate (CER). Zero-shot, all three Whisper models fail on Khmer (CER ≥ 133%), looping on a repeated character or misidentifying the language, whereas the MMS-1B CTC model with its Khmer adapter reaches 9.7% CER on the held-out test set. Fine-tuning on nested 10, 50 and 100 h subsets lowers test CER for both families; Whisper small gains most, from 19.4% at 10 h to 4.7% at 100 h, overtaking MMS (5.2%). On the out-of-domain FLEURS benchmark the ranking reverses (MMS 15.0%, Whisper 24.5%), showing that a same-corpus test set overstates real-world quality.</w:t>
       </w:r>
     </w:p>
     <w:p>
@@ -118,6 +118,14 @@
       </w:pPr>
       <w:r>
         <w:t>Zero-shot baselines for two model families, Whisper (encoder-decoder) and MMS (CTC), including a diagnosis of Whisper's failure mode (Section 5).</w:t>
+      </w:r>
+    </w:p>
+    <w:p>
+      <w:pPr>
+        <w:pStyle w:val="ListBullet"/>
+      </w:pPr>
+      <w:r>
+        <w:t>A controlled data-scaling study (10, 50, 100 h) for both families, evaluated in and out of domain (Section 6).</w:t>
       </w:r>
     </w:p>
     <w:p>
@@ -1715,6 +1723,22 @@
     </w:p>
     <w:p>
       <w:pPr>
+        <w:pStyle w:val="Heading2"/>
+      </w:pPr>
+      <w:r>
+        <w:t>4.4 Fine-tuning setup</w:t>
+      </w:r>
+    </w:p>
+    <w:p>
+      <w:pPr>
+        <w:jc w:val="both"/>
+      </w:pPr>
+      <w:r>
+        <w:t>Whisper small is fully fine-tuned (learning rate 1e-5). For MMS-1B the base model is frozen and a new Khmer adapter and output layer are trained (learning rate 1e-3) on a character vocabulary built from the training text, which restores the digits the released adapter lacks. Training subsets of 10, 50 and 100 h are drawn by whole files with a fixed seed and are nested (10 h ⊂ 50 h ⊂ 100 h). Every run trains for 3.5 passes over its subset with batch size 16 and 100 warm-up steps, so only the amount of data changes. Checkpoints are selected on validation (unseen sentences); Whisper transcripts longer than its 448-token decoder limit are excluded from training (about 1%). Training ran on one NVIDIA A40 (48 GB) at RunPod; test-set and FLEURS scores use the same evaluation code as the zero-shot baselines.</w:t>
+      </w:r>
+    </w:p>
+    <w:p>
+      <w:pPr>
         <w:pStyle w:val="Heading1"/>
       </w:pPr>
       <w:r>
@@ -2792,7 +2816,873 @@
         <w:pStyle w:val="Heading1"/>
       </w:pPr>
       <w:r>
-        <w:t>6. Planned Fine-Tuning Experiments</w:t>
+        <w:t>6. Fine-Tuning and Data Scaling (M1, S)</w:t>
+      </w:r>
+    </w:p>
+    <w:p>
+      <w:pPr>
+        <w:pStyle w:val="Caption"/>
+        <w:keepNext/>
+        <w:jc w:val="center"/>
+      </w:pPr>
+      <w:r>
+        <w:t>Table 6. Fine-tuned models: validation CER of the selected checkpoint, test CER with 95% bootstrap interval (all 3,712 clips), FLEURS CER (771 clips) and training time on one A40. Validation uses 1,288 clips for MMS and 300 for Whisper (decoding is slower).</w:t>
+      </w:r>
+    </w:p>
+    <w:tbl>
+      <w:tblPr>
+        <w:tblStyle w:val="TableGrid"/>
+        <w:tblW w:type="auto" w:w="0"/>
+        <w:jc w:val="center"/>
+        <w:tblLook w:firstColumn="1" w:firstRow="1" w:lastColumn="0" w:lastRow="0" w:noHBand="0" w:noVBand="1" w:val="04A0"/>
+      </w:tblPr>
+      <w:tblGrid>
+        <w:gridCol w:w="1569"/>
+        <w:gridCol w:w="1569"/>
+        <w:gridCol w:w="1569"/>
+        <w:gridCol w:w="1569"/>
+        <w:gridCol w:w="1569"/>
+        <w:gridCol w:w="1569"/>
+      </w:tblGrid>
+      <w:tr>
+        <w:trPr>
+          <w:cantSplit/>
+        </w:trPr>
+        <w:tc>
+          <w:tcPr>
+            <w:tcW w:type="dxa" w:w="1701"/>
+            <w:shd w:val="clear" w:color="auto" w:fill="E8EEF7"/>
+          </w:tcPr>
+          <w:p>
+            <w:pPr>
+              <w:keepNext/>
+              <w:spacing w:after="0"/>
+            </w:pPr>
+            <w:r>
+              <w:rPr>
+                <w:sz w:val="17"/>
+              </w:rPr>
+            </w:r>
+            <w:r>
+              <w:rPr>
+                <w:b/>
+                <w:sz w:val="17"/>
+              </w:rPr>
+              <w:t>Model</w:t>
+            </w:r>
+          </w:p>
+        </w:tc>
+        <w:tc>
+          <w:tcPr>
+            <w:tcW w:type="dxa" w:w="794"/>
+            <w:shd w:val="clear" w:color="auto" w:fill="E8EEF7"/>
+          </w:tcPr>
+          <w:p>
+            <w:pPr>
+              <w:keepNext/>
+              <w:spacing w:after="0"/>
+            </w:pPr>
+            <w:r>
+              <w:rPr>
+                <w:sz w:val="17"/>
+              </w:rPr>
+            </w:r>
+            <w:r>
+              <w:rPr>
+                <w:b/>
+                <w:sz w:val="17"/>
+              </w:rPr>
+              <w:t>Data</w:t>
+            </w:r>
+          </w:p>
+        </w:tc>
+        <w:tc>
+          <w:tcPr>
+            <w:tcW w:type="dxa" w:w="1134"/>
+            <w:shd w:val="clear" w:color="auto" w:fill="E8EEF7"/>
+          </w:tcPr>
+          <w:p>
+            <w:pPr>
+              <w:keepNext/>
+              <w:spacing w:after="0"/>
+            </w:pPr>
+            <w:r>
+              <w:rPr>
+                <w:sz w:val="17"/>
+              </w:rPr>
+            </w:r>
+            <w:r>
+              <w:rPr>
+                <w:b/>
+                <w:sz w:val="17"/>
+              </w:rPr>
+              <w:t>Validation</w:t>
+            </w:r>
+          </w:p>
+        </w:tc>
+        <w:tc>
+          <w:tcPr>
+            <w:tcW w:type="dxa" w:w="2494"/>
+            <w:shd w:val="clear" w:color="auto" w:fill="E8EEF7"/>
+          </w:tcPr>
+          <w:p>
+            <w:pPr>
+              <w:keepNext/>
+              <w:spacing w:after="0"/>
+            </w:pPr>
+            <w:r>
+              <w:rPr>
+                <w:sz w:val="17"/>
+              </w:rPr>
+            </w:r>
+            <w:r>
+              <w:rPr>
+                <w:b/>
+                <w:sz w:val="17"/>
+              </w:rPr>
+              <w:t>Test CER [95% CI]</w:t>
+            </w:r>
+          </w:p>
+        </w:tc>
+        <w:tc>
+          <w:tcPr>
+            <w:tcW w:type="dxa" w:w="1077"/>
+            <w:shd w:val="clear" w:color="auto" w:fill="E8EEF7"/>
+          </w:tcPr>
+          <w:p>
+            <w:pPr>
+              <w:keepNext/>
+              <w:spacing w:after="0"/>
+            </w:pPr>
+            <w:r>
+              <w:rPr>
+                <w:sz w:val="17"/>
+              </w:rPr>
+            </w:r>
+            <w:r>
+              <w:rPr>
+                <w:b/>
+                <w:sz w:val="17"/>
+              </w:rPr>
+              <w:t>FLEURS</w:t>
+            </w:r>
+          </w:p>
+        </w:tc>
+        <w:tc>
+          <w:tcPr>
+            <w:tcW w:type="dxa" w:w="1134"/>
+            <w:shd w:val="clear" w:color="auto" w:fill="E8EEF7"/>
+          </w:tcPr>
+          <w:p>
+            <w:pPr>
+              <w:keepNext/>
+              <w:spacing w:after="0"/>
+            </w:pPr>
+            <w:r>
+              <w:rPr>
+                <w:sz w:val="17"/>
+              </w:rPr>
+            </w:r>
+            <w:r>
+              <w:rPr>
+                <w:b/>
+                <w:sz w:val="17"/>
+              </w:rPr>
+              <w:t>Train (min)</w:t>
+            </w:r>
+          </w:p>
+        </w:tc>
+      </w:tr>
+      <w:tr>
+        <w:trPr>
+          <w:cantSplit/>
+        </w:trPr>
+        <w:tc>
+          <w:tcPr>
+            <w:tcW w:type="dxa" w:w="1701"/>
+          </w:tcPr>
+          <w:p>
+            <w:pPr>
+              <w:keepNext/>
+              <w:spacing w:after="0"/>
+            </w:pPr>
+            <w:r>
+              <w:rPr>
+                <w:sz w:val="17"/>
+              </w:rPr>
+              <w:t>Whisper small</w:t>
+            </w:r>
+          </w:p>
+        </w:tc>
+        <w:tc>
+          <w:tcPr>
+            <w:tcW w:type="dxa" w:w="794"/>
+          </w:tcPr>
+          <w:p>
+            <w:pPr>
+              <w:keepNext/>
+              <w:spacing w:after="0"/>
+            </w:pPr>
+            <w:r>
+              <w:rPr>
+                <w:sz w:val="17"/>
+              </w:rPr>
+              <w:t>10 h</w:t>
+            </w:r>
+          </w:p>
+        </w:tc>
+        <w:tc>
+          <w:tcPr>
+            <w:tcW w:type="dxa" w:w="1134"/>
+          </w:tcPr>
+          <w:p>
+            <w:pPr>
+              <w:keepNext/>
+              <w:spacing w:after="0"/>
+            </w:pPr>
+            <w:r>
+              <w:rPr>
+                <w:sz w:val="17"/>
+              </w:rPr>
+              <w:t>17.86%</w:t>
+            </w:r>
+          </w:p>
+        </w:tc>
+        <w:tc>
+          <w:tcPr>
+            <w:tcW w:type="dxa" w:w="2494"/>
+          </w:tcPr>
+          <w:p>
+            <w:pPr>
+              <w:keepNext/>
+              <w:spacing w:after="0"/>
+            </w:pPr>
+            <w:r>
+              <w:rPr>
+                <w:sz w:val="17"/>
+              </w:rPr>
+              <w:t>19.43% [19.08%–19.78%]</w:t>
+            </w:r>
+          </w:p>
+        </w:tc>
+        <w:tc>
+          <w:tcPr>
+            <w:tcW w:type="dxa" w:w="1077"/>
+          </w:tcPr>
+          <w:p>
+            <w:pPr>
+              <w:keepNext/>
+              <w:spacing w:after="0"/>
+            </w:pPr>
+            <w:r>
+              <w:rPr>
+                <w:sz w:val="17"/>
+              </w:rPr>
+              <w:t>51.26%</w:t>
+            </w:r>
+          </w:p>
+        </w:tc>
+        <w:tc>
+          <w:tcPr>
+            <w:tcW w:type="dxa" w:w="1134"/>
+          </w:tcPr>
+          <w:p>
+            <w:pPr>
+              <w:keepNext/>
+              <w:spacing w:after="0"/>
+            </w:pPr>
+            <w:r>
+              <w:rPr>
+                <w:sz w:val="17"/>
+              </w:rPr>
+              <w:t>18</w:t>
+            </w:r>
+          </w:p>
+        </w:tc>
+      </w:tr>
+      <w:tr>
+        <w:trPr>
+          <w:cantSplit/>
+        </w:trPr>
+        <w:tc>
+          <w:tcPr>
+            <w:tcW w:type="dxa" w:w="1701"/>
+          </w:tcPr>
+          <w:p>
+            <w:pPr>
+              <w:keepNext/>
+              <w:spacing w:after="0"/>
+            </w:pPr>
+            <w:r>
+              <w:rPr>
+                <w:sz w:val="17"/>
+              </w:rPr>
+              <w:t>Whisper small</w:t>
+            </w:r>
+          </w:p>
+        </w:tc>
+        <w:tc>
+          <w:tcPr>
+            <w:tcW w:type="dxa" w:w="794"/>
+          </w:tcPr>
+          <w:p>
+            <w:pPr>
+              <w:keepNext/>
+              <w:spacing w:after="0"/>
+            </w:pPr>
+            <w:r>
+              <w:rPr>
+                <w:sz w:val="17"/>
+              </w:rPr>
+              <w:t>50 h</w:t>
+            </w:r>
+          </w:p>
+        </w:tc>
+        <w:tc>
+          <w:tcPr>
+            <w:tcW w:type="dxa" w:w="1134"/>
+          </w:tcPr>
+          <w:p>
+            <w:pPr>
+              <w:keepNext/>
+              <w:spacing w:after="0"/>
+            </w:pPr>
+            <w:r>
+              <w:rPr>
+                <w:sz w:val="17"/>
+              </w:rPr>
+              <w:t>3.81%</w:t>
+            </w:r>
+          </w:p>
+        </w:tc>
+        <w:tc>
+          <w:tcPr>
+            <w:tcW w:type="dxa" w:w="2494"/>
+          </w:tcPr>
+          <w:p>
+            <w:pPr>
+              <w:keepNext/>
+              <w:spacing w:after="0"/>
+            </w:pPr>
+            <w:r>
+              <w:rPr>
+                <w:sz w:val="17"/>
+              </w:rPr>
+              <w:t>6.40% [6.18%–6.63%]</w:t>
+            </w:r>
+          </w:p>
+        </w:tc>
+        <w:tc>
+          <w:tcPr>
+            <w:tcW w:type="dxa" w:w="1077"/>
+          </w:tcPr>
+          <w:p>
+            <w:pPr>
+              <w:keepNext/>
+              <w:spacing w:after="0"/>
+            </w:pPr>
+            <w:r>
+              <w:rPr>
+                <w:sz w:val="17"/>
+              </w:rPr>
+              <w:t>32.82%</w:t>
+            </w:r>
+          </w:p>
+        </w:tc>
+        <w:tc>
+          <w:tcPr>
+            <w:tcW w:type="dxa" w:w="1134"/>
+          </w:tcPr>
+          <w:p>
+            <w:pPr>
+              <w:keepNext/>
+              <w:spacing w:after="0"/>
+            </w:pPr>
+            <w:r>
+              <w:rPr>
+                <w:sz w:val="17"/>
+              </w:rPr>
+              <w:t>59</w:t>
+            </w:r>
+          </w:p>
+        </w:tc>
+      </w:tr>
+      <w:tr>
+        <w:trPr>
+          <w:cantSplit/>
+        </w:trPr>
+        <w:tc>
+          <w:tcPr>
+            <w:tcW w:type="dxa" w:w="1701"/>
+          </w:tcPr>
+          <w:p>
+            <w:pPr>
+              <w:keepNext/>
+              <w:spacing w:after="0"/>
+            </w:pPr>
+            <w:r>
+              <w:rPr>
+                <w:sz w:val="17"/>
+              </w:rPr>
+              <w:t>Whisper small</w:t>
+            </w:r>
+          </w:p>
+        </w:tc>
+        <w:tc>
+          <w:tcPr>
+            <w:tcW w:type="dxa" w:w="794"/>
+          </w:tcPr>
+          <w:p>
+            <w:pPr>
+              <w:keepNext/>
+              <w:spacing w:after="0"/>
+            </w:pPr>
+            <w:r>
+              <w:rPr>
+                <w:sz w:val="17"/>
+              </w:rPr>
+              <w:t>100 h</w:t>
+            </w:r>
+          </w:p>
+        </w:tc>
+        <w:tc>
+          <w:tcPr>
+            <w:tcW w:type="dxa" w:w="1134"/>
+          </w:tcPr>
+          <w:p>
+            <w:pPr>
+              <w:keepNext/>
+              <w:spacing w:after="0"/>
+            </w:pPr>
+            <w:r>
+              <w:rPr>
+                <w:sz w:val="17"/>
+              </w:rPr>
+              <w:t>2.40%</w:t>
+            </w:r>
+          </w:p>
+        </w:tc>
+        <w:tc>
+          <w:tcPr>
+            <w:tcW w:type="dxa" w:w="2494"/>
+          </w:tcPr>
+          <w:p>
+            <w:pPr>
+              <w:keepNext/>
+              <w:spacing w:after="0"/>
+            </w:pPr>
+            <w:r>
+              <w:rPr>
+                <w:sz w:val="17"/>
+              </w:rPr>
+              <w:t>4.70% [4.48%–4.93%]</w:t>
+            </w:r>
+          </w:p>
+        </w:tc>
+        <w:tc>
+          <w:tcPr>
+            <w:tcW w:type="dxa" w:w="1077"/>
+          </w:tcPr>
+          <w:p>
+            <w:pPr>
+              <w:keepNext/>
+              <w:spacing w:after="0"/>
+            </w:pPr>
+            <w:r>
+              <w:rPr>
+                <w:sz w:val="17"/>
+              </w:rPr>
+              <w:t>24.48%</w:t>
+            </w:r>
+          </w:p>
+        </w:tc>
+        <w:tc>
+          <w:tcPr>
+            <w:tcW w:type="dxa" w:w="1134"/>
+          </w:tcPr>
+          <w:p>
+            <w:pPr>
+              <w:keepNext/>
+              <w:spacing w:after="0"/>
+            </w:pPr>
+            <w:r>
+              <w:rPr>
+                <w:sz w:val="17"/>
+              </w:rPr>
+              <w:t>113</w:t>
+            </w:r>
+          </w:p>
+        </w:tc>
+      </w:tr>
+      <w:tr>
+        <w:trPr>
+          <w:cantSplit/>
+        </w:trPr>
+        <w:tc>
+          <w:tcPr>
+            <w:tcW w:type="dxa" w:w="1701"/>
+          </w:tcPr>
+          <w:p>
+            <w:pPr>
+              <w:keepNext/>
+              <w:spacing w:after="0"/>
+            </w:pPr>
+            <w:r>
+              <w:rPr>
+                <w:sz w:val="17"/>
+              </w:rPr>
+              <w:t>MMS-1B</w:t>
+            </w:r>
+          </w:p>
+        </w:tc>
+        <w:tc>
+          <w:tcPr>
+            <w:tcW w:type="dxa" w:w="794"/>
+          </w:tcPr>
+          <w:p>
+            <w:pPr>
+              <w:keepNext/>
+              <w:spacing w:after="0"/>
+            </w:pPr>
+            <w:r>
+              <w:rPr>
+                <w:sz w:val="17"/>
+              </w:rPr>
+              <w:t>10 h</w:t>
+            </w:r>
+          </w:p>
+        </w:tc>
+        <w:tc>
+          <w:tcPr>
+            <w:tcW w:type="dxa" w:w="1134"/>
+          </w:tcPr>
+          <w:p>
+            <w:pPr>
+              <w:keepNext/>
+              <w:spacing w:after="0"/>
+            </w:pPr>
+            <w:r>
+              <w:rPr>
+                <w:sz w:val="17"/>
+              </w:rPr>
+              <w:t>8.85%</w:t>
+            </w:r>
+          </w:p>
+        </w:tc>
+        <w:tc>
+          <w:tcPr>
+            <w:tcW w:type="dxa" w:w="2494"/>
+          </w:tcPr>
+          <w:p>
+            <w:pPr>
+              <w:keepNext/>
+              <w:spacing w:after="0"/>
+            </w:pPr>
+            <w:r>
+              <w:rPr>
+                <w:sz w:val="17"/>
+              </w:rPr>
+              <w:t>8.43% [8.25%–8.64%]</w:t>
+            </w:r>
+          </w:p>
+        </w:tc>
+        <w:tc>
+          <w:tcPr>
+            <w:tcW w:type="dxa" w:w="1077"/>
+          </w:tcPr>
+          <w:p>
+            <w:pPr>
+              <w:keepNext/>
+              <w:spacing w:after="0"/>
+            </w:pPr>
+            <w:r>
+              <w:rPr>
+                <w:sz w:val="17"/>
+              </w:rPr>
+              <w:t>16.72%</w:t>
+            </w:r>
+          </w:p>
+        </w:tc>
+        <w:tc>
+          <w:tcPr>
+            <w:tcW w:type="dxa" w:w="1134"/>
+          </w:tcPr>
+          <w:p>
+            <w:pPr>
+              <w:keepNext/>
+              <w:spacing w:after="0"/>
+            </w:pPr>
+            <w:r>
+              <w:rPr>
+                <w:sz w:val="17"/>
+              </w:rPr>
+              <w:t>51</w:t>
+            </w:r>
+          </w:p>
+        </w:tc>
+      </w:tr>
+      <w:tr>
+        <w:trPr>
+          <w:cantSplit/>
+        </w:trPr>
+        <w:tc>
+          <w:tcPr>
+            <w:tcW w:type="dxa" w:w="1701"/>
+          </w:tcPr>
+          <w:p>
+            <w:pPr>
+              <w:keepNext/>
+              <w:spacing w:after="0"/>
+            </w:pPr>
+            <w:r>
+              <w:rPr>
+                <w:sz w:val="17"/>
+              </w:rPr>
+              <w:t>MMS-1B</w:t>
+            </w:r>
+          </w:p>
+        </w:tc>
+        <w:tc>
+          <w:tcPr>
+            <w:tcW w:type="dxa" w:w="794"/>
+          </w:tcPr>
+          <w:p>
+            <w:pPr>
+              <w:keepNext/>
+              <w:spacing w:after="0"/>
+            </w:pPr>
+            <w:r>
+              <w:rPr>
+                <w:sz w:val="17"/>
+              </w:rPr>
+              <w:t>50 h</w:t>
+            </w:r>
+          </w:p>
+        </w:tc>
+        <w:tc>
+          <w:tcPr>
+            <w:tcW w:type="dxa" w:w="1134"/>
+          </w:tcPr>
+          <w:p>
+            <w:pPr>
+              <w:keepNext/>
+              <w:spacing w:after="0"/>
+            </w:pPr>
+            <w:r>
+              <w:rPr>
+                <w:sz w:val="17"/>
+              </w:rPr>
+              <w:t>6.38%</w:t>
+            </w:r>
+          </w:p>
+        </w:tc>
+        <w:tc>
+          <w:tcPr>
+            <w:tcW w:type="dxa" w:w="2494"/>
+          </w:tcPr>
+          <w:p>
+            <w:pPr>
+              <w:keepNext/>
+              <w:spacing w:after="0"/>
+            </w:pPr>
+            <w:r>
+              <w:rPr>
+                <w:sz w:val="17"/>
+              </w:rPr>
+              <w:t>6.20% [6.05%–6.39%]</w:t>
+            </w:r>
+          </w:p>
+        </w:tc>
+        <w:tc>
+          <w:tcPr>
+            <w:tcW w:type="dxa" w:w="1077"/>
+          </w:tcPr>
+          <w:p>
+            <w:pPr>
+              <w:keepNext/>
+              <w:spacing w:after="0"/>
+            </w:pPr>
+            <w:r>
+              <w:rPr>
+                <w:sz w:val="17"/>
+              </w:rPr>
+              <w:t>15.69%</w:t>
+            </w:r>
+          </w:p>
+        </w:tc>
+        <w:tc>
+          <w:tcPr>
+            <w:tcW w:type="dxa" w:w="1134"/>
+          </w:tcPr>
+          <w:p>
+            <w:pPr>
+              <w:keepNext/>
+              <w:spacing w:after="0"/>
+            </w:pPr>
+            <w:r>
+              <w:rPr>
+                <w:sz w:val="17"/>
+              </w:rPr>
+              <w:t>234</w:t>
+            </w:r>
+          </w:p>
+        </w:tc>
+      </w:tr>
+      <w:tr>
+        <w:trPr>
+          <w:cantSplit/>
+        </w:trPr>
+        <w:tc>
+          <w:tcPr>
+            <w:tcW w:type="dxa" w:w="1701"/>
+          </w:tcPr>
+          <w:p>
+            <w:pPr>
+              <w:keepNext w:val="0"/>
+              <w:spacing w:after="0"/>
+            </w:pPr>
+            <w:r>
+              <w:rPr>
+                <w:sz w:val="17"/>
+              </w:rPr>
+              <w:t>MMS-1B</w:t>
+            </w:r>
+          </w:p>
+        </w:tc>
+        <w:tc>
+          <w:tcPr>
+            <w:tcW w:type="dxa" w:w="794"/>
+          </w:tcPr>
+          <w:p>
+            <w:pPr>
+              <w:keepNext w:val="0"/>
+              <w:spacing w:after="0"/>
+            </w:pPr>
+            <w:r>
+              <w:rPr>
+                <w:sz w:val="17"/>
+              </w:rPr>
+              <w:t>100 h</w:t>
+            </w:r>
+          </w:p>
+        </w:tc>
+        <w:tc>
+          <w:tcPr>
+            <w:tcW w:type="dxa" w:w="1134"/>
+          </w:tcPr>
+          <w:p>
+            <w:pPr>
+              <w:keepNext w:val="0"/>
+              <w:spacing w:after="0"/>
+            </w:pPr>
+            <w:r>
+              <w:rPr>
+                <w:sz w:val="17"/>
+              </w:rPr>
+              <w:t>5.33%</w:t>
+            </w:r>
+          </w:p>
+        </w:tc>
+        <w:tc>
+          <w:tcPr>
+            <w:tcW w:type="dxa" w:w="2494"/>
+          </w:tcPr>
+          <w:p>
+            <w:pPr>
+              <w:keepNext w:val="0"/>
+              <w:spacing w:after="0"/>
+            </w:pPr>
+            <w:r>
+              <w:rPr>
+                <w:sz w:val="17"/>
+              </w:rPr>
+              <w:t>5.24% [5.07%–5.42%]</w:t>
+            </w:r>
+          </w:p>
+        </w:tc>
+        <w:tc>
+          <w:tcPr>
+            <w:tcW w:type="dxa" w:w="1077"/>
+          </w:tcPr>
+          <w:p>
+            <w:pPr>
+              <w:keepNext w:val="0"/>
+              <w:spacing w:after="0"/>
+            </w:pPr>
+            <w:r>
+              <w:rPr>
+                <w:sz w:val="17"/>
+              </w:rPr>
+              <w:t>14.97%</w:t>
+            </w:r>
+          </w:p>
+        </w:tc>
+        <w:tc>
+          <w:tcPr>
+            <w:tcW w:type="dxa" w:w="1134"/>
+          </w:tcPr>
+          <w:p>
+            <w:pPr>
+              <w:keepNext w:val="0"/>
+              <w:spacing w:after="0"/>
+            </w:pPr>
+            <w:r>
+              <w:rPr>
+                <w:sz w:val="17"/>
+              </w:rPr>
+              <w:t>464</w:t>
+            </w:r>
+          </w:p>
+        </w:tc>
+      </w:tr>
+    </w:tbl>
+    <w:p/>
+    <w:p>
+      <w:pPr>
+        <w:jc w:val="center"/>
+      </w:pPr>
+      <w:r>
+        <w:drawing>
+          <wp:inline xmlns:a="http://schemas.openxmlformats.org/drawingml/2006/main" xmlns:pic="http://schemas.openxmlformats.org/drawingml/2006/picture">
+            <wp:extent cx="5580000" cy="2536364"/>
+            <wp:docPr id="2" name="Picture 2"/>
+            <wp:cNvGraphicFramePr>
+              <a:graphicFrameLocks noChangeAspect="1"/>
+            </wp:cNvGraphicFramePr>
+            <a:graphic>
+              <a:graphicData uri="http://schemas.openxmlformats.org/drawingml/2006/picture">
+                <pic:pic>
+                  <pic:nvPicPr>
+                    <pic:cNvPr id="0" name="fig_scaling.png"/>
+                    <pic:cNvPicPr/>
+                  </pic:nvPicPr>
+                  <pic:blipFill>
+                    <a:blip r:embed="rId10"/>
+                    <a:stretch>
+                      <a:fillRect/>
+                    </a:stretch>
+                  </pic:blipFill>
+                  <pic:spPr>
+                    <a:xfrm>
+                      <a:off x="0" y="0"/>
+                      <a:ext cx="5580000" cy="2536364"/>
+                    </a:xfrm>
+                    <a:prstGeom prst="rect"/>
+                  </pic:spPr>
+                </pic:pic>
+              </a:graphicData>
+            </a:graphic>
+          </wp:inline>
+        </w:drawing>
+      </w:r>
+    </w:p>
+    <w:p>
+      <w:pPr>
+        <w:pStyle w:val="Caption"/>
+        <w:jc w:val="center"/>
+      </w:pPr>
+      <w:r>
+        <w:t>Figure 2. CER against training hours (log scale). The dashed line is zero-shot MMS; zero-shot Whisper (&gt; 100%) is off the chart.</w:t>
       </w:r>
     </w:p>
     <w:p>
@@ -2800,7 +3690,49 @@
         <w:jc w:val="both"/>
       </w:pPr>
       <w:r>
-        <w:t>All experiments use the same locked test set and normalization, change one variable at a time, and select checkpoints on validation only.</w:t>
+        <w:rPr>
+          <w:b/>
+        </w:rPr>
+        <w:t xml:space="preserve">In domain. </w:t>
+      </w:r>
+      <w:r>
+        <w:t>Fine-tuning helps both families in domain. Whisper small goes from unusable zero-shot to 19.4% test CER with 10 h and 4.7% with 100 h. MMS starts from a strong zero-shot model (9.7%) and improves steadily to 5.2%. At 10 h MMS is clearly better; at 50 h the two are tied (Whisper 6.40%, MMS 6.20%, overlapping intervals); at 100 h Whisper is significantly better (non-overlapping intervals). Neither curve has flattened at 100 h.</w:t>
+      </w:r>
+    </w:p>
+    <w:p>
+      <w:pPr>
+        <w:jc w:val="both"/>
+      </w:pPr>
+      <w:r>
+        <w:rPr>
+          <w:b/>
+        </w:rPr>
+        <w:t xml:space="preserve">Out of domain. </w:t>
+      </w:r>
+      <w:r>
+        <w:t>On FLEURS the picture changes. Fine-tuned MMS stays close to its zero-shot score (16.7%, 15.7%, 15.0% vs 15.5%): its new adapter, trained only on this corpus, first loses some of the generality of Meta's adapter and needs 100 h to recover it. Whisper improves most with data (51.3% → 24.5%) but stays far behind MMS. A model that wins on a same-corpus test set can therefore lose badly on other speech; out-of-domain evaluation is essential for Khmer.</w:t>
+      </w:r>
+    </w:p>
+    <w:p>
+      <w:pPr>
+        <w:jc w:val="both"/>
+      </w:pPr>
+      <w:r>
+        <w:rPr>
+          <w:b/>
+        </w:rPr>
+        <w:t xml:space="preserve">Cost. </w:t>
+      </w:r>
+      <w:r>
+        <w:t>MMS trains only 2.3M adapter parameters but runs a 1B-parameter encoder, so each step is slower: training 100 h took 464 min for MMS versus 113 min for Whisper small on the same GPU. Training all 6 runs cost 9.44 USD of GPU time at 0.59 USD per hour.</w:t>
+      </w:r>
+    </w:p>
+    <w:p>
+      <w:pPr>
+        <w:pStyle w:val="Heading1"/>
+      </w:pPr>
+      <w:r>
+        <w:t>7. Planned Experiments</w:t>
       </w:r>
     </w:p>
     <w:p>
@@ -2808,7 +3740,7 @@
         <w:pStyle w:val="ListBullet"/>
       </w:pPr>
       <w:r>
-        <w:t>M1 — Fine-tune a pretrained model on the training split; compare with its M0 baseline (RQ1).</w:t>
+        <w:t>M2 — One Khmer-specific strategy, chosen to address the out-of-domain gap: initialise the MMS adapter from Meta's released Khmer adapter instead of from scratch, or add the FLEURS training split to the training data (RQ3).</w:t>
       </w:r>
     </w:p>
     <w:p>
@@ -2816,23 +3748,7 @@
         <w:pStyle w:val="ListBullet"/>
       </w:pPr>
       <w:r>
-        <w:t>S — Train on nested subsets (e.g. 10, 50, 100 h) to measure the effect of data quantity (RQ2).</w:t>
-      </w:r>
-    </w:p>
-    <w:p>
-      <w:pPr>
-        <w:pStyle w:val="ListBullet"/>
-      </w:pPr>
-      <w:r>
-        <w:t>M2 — Add one Khmer-specific strategy (normalization, augmentation or fine-tuning method) (RQ3).</w:t>
-      </w:r>
-    </w:p>
-    <w:p>
-      <w:pPr>
-        <w:pStyle w:val="ListBullet"/>
-      </w:pPr>
-      <w:r>
-        <w:t>M3 (optional) — Compare Whisper and MMS families after fine-tuning (RQ4).</w:t>
+        <w:t>Optional — Whisper small on the full training split, to see where the in-domain curve flattens.</w:t>
       </w:r>
     </w:p>
     <w:p>
@@ -2840,7 +3756,7 @@
         <w:pStyle w:val="Heading1"/>
       </w:pPr>
       <w:r>
-        <w:t>7. Limitations</w:t>
+        <w:t>8. Limitations</w:t>
       </w:r>
     </w:p>
     <w:p>
@@ -2872,7 +3788,39 @@
         <w:pStyle w:val="ListBullet"/>
       </w:pPr>
       <w:r>
-        <w:t>Each configuration is a single run; we report bootstrap intervals over clips, not over training seeds.</w:t>
+        <w:t>Each configuration is a single training run; we report bootstrap intervals over clips, not over training seeds.</w:t>
+      </w:r>
+    </w:p>
+    <w:p>
+      <w:pPr>
+        <w:pStyle w:val="ListBullet"/>
+      </w:pPr>
+      <w:r>
+        <w:t>Validation sizes differ between families (1,288 clips for MMS, 300 for Whisper), so validation CERs are not directly comparable; test and FLEURS use identical clips.</w:t>
+      </w:r>
+    </w:p>
+    <w:p>
+      <w:pPr>
+        <w:pStyle w:val="ListBullet"/>
+      </w:pPr>
+      <w:r>
+        <w:t>24 test clips (0.65%) have transcripts longer than Whisper's 448-token decoder limit and count against Whisper.</w:t>
+      </w:r>
+    </w:p>
+    <w:p>
+      <w:pPr>
+        <w:pStyle w:val="ListBullet"/>
+      </w:pPr>
+      <w:r>
+        <w:t>Inference speed was measured on different GPUs (laptop RTX 4060 for zero-shot and 10 h models, A40 for 50 and 100 h), so it is not compared across runs.</w:t>
+      </w:r>
+    </w:p>
+    <w:p>
+      <w:pPr>
+        <w:pStyle w:val="ListBullet"/>
+      </w:pPr>
+      <w:r>
+        <w:t>Training subsets are drawn by whole files, so small subsets cover fewer topics.</w:t>
       </w:r>
     </w:p>
     <w:p>
@@ -2896,7 +3844,7 @@
         <w:pStyle w:val="Heading1"/>
       </w:pPr>
       <w:r>
-        <w:t>8. Conclusion</w:t>
+        <w:t>9. Conclusion</w:t>
       </w:r>
     </w:p>
     <w:p>
@@ -2904,7 +3852,7 @@
         <w:jc w:val="both"/>
       </w:pPr>
       <w:r>
-        <w:t>A full audit of the largest open Khmer speech corpus shows that its sentences are shared across speakers, which makes leakage-free evaluation essential. With a split that holds out speakers and sentences and a documented normalization protocol, zero-shot Whisper is unusable for Khmer while MMS with a Khmer adapter is already a strong starting point. The next step is controlled fine-tuning on the same protocol.</w:t>
+        <w:t>A full audit of the largest open Khmer speech corpus shows that its sentences are shared across speakers, which makes leakage-free evaluation essential. With a split that holds out speakers and sentences and a documented normalization protocol, zero-shot Whisper is unusable for Khmer while MMS with a Khmer adapter is already a strong starting point. Fine-tuning on 10–100 h closes the gap for Whisper and lets it overtake MMS in domain, but MMS remains far more robust on out-of-domain speech. The next step is a Khmer-specific strategy aimed at that robustness gap.</w:t>
       </w:r>
     </w:p>
     <w:p>

</xml_diff>